<commit_message>
Add Wireshark captures and update report with images
Include 3 Wireshark PNG captures (ICMP tracert, packet detail,
ping RTT) and network diagram PNG. Regenerated Word document
now embeds all 4 images with captions in their respective sections.
Also ignore Word temporary lock files (~$*.docx) in .gitignore.

Co-Authored-By: Claude Sonnet 4.6 <noreply@anthropic.com>
</commit_message>
<xml_diff>
--- a/Entrega1/Entrega1_Telecomunicaciones_Poli.docx
+++ b/Entrega1/Entrega1_Telecomunicaciones_Poli.docx
@@ -4975,6 +4975,200 @@
     </w:p>
     <w:p>
       <w:pPr>
+        <w:spacing w:after="60" w:before="160"/>
+        <w:jc w:val="center"/>
+      </w:pPr>
+      <w:r>
+        <w:drawing>
+          <wp:inline distT="0" distB="0" distL="0" distR="0">
+            <wp:extent cx="5715000" cy="3219450"/>
+            <wp:effectExtent t="0" r="0" b="0" l="0"/>
+            <wp:docPr id="1" name="Figura 1: Captura Wireshark — Tráfico ICMP del comando tracert a www.poli.edu.co" descr="Figura 1: Captura Wireshark — Tráfico ICMP del comando tracert a www.poli.edu.co" title="Figura 1: Captura Wireshark — Tráfico ICMP del comando tracert a www.poli.edu.co"/>
+            <wp:cNvGraphicFramePr>
+              <a:graphicFrameLocks xmlns:a="http://schemas.openxmlformats.org/drawingml/2006/main" noChangeAspect="1"/>
+            </wp:cNvGraphicFramePr>
+            <a:graphic xmlns:a="http://schemas.openxmlformats.org/drawingml/2006/main">
+              <a:graphicData uri="http://schemas.openxmlformats.org/drawingml/2006/picture">
+                <pic:pic xmlns:pic="http://schemas.openxmlformats.org/drawingml/2006/picture">
+                  <pic:nvPicPr>
+                    <pic:cNvPr id="0" name="" descr=""/>
+                    <pic:cNvPicPr>
+                      <a:picLocks noChangeAspect="1" noChangeArrowheads="1"/>
+                    </pic:cNvPicPr>
+                  </pic:nvPicPr>
+                  <pic:blipFill>
+                    <a:blip r:embed="rId9" cstate="none"/>
+                    <a:srcRect/>
+                    <a:stretch>
+                      <a:fillRect/>
+                    </a:stretch>
+                  </pic:blipFill>
+                  <pic:spPr bwMode="auto">
+                    <a:xfrm>
+                      <a:off x="0" y="0"/>
+                      <a:ext cx="5715000" cy="3219450"/>
+                    </a:xfrm>
+                    <a:prstGeom prst="rect">
+                      <a:avLst/>
+                    </a:prstGeom>
+                  </pic:spPr>
+                </pic:pic>
+              </a:graphicData>
+            </a:graphic>
+          </wp:inline>
+        </w:drawing>
+      </w:r>
+    </w:p>
+    <w:p>
+      <w:pPr>
+        <w:spacing w:after="160" w:before="0"/>
+        <w:jc w:val="center"/>
+      </w:pPr>
+      <w:r>
+        <w:rPr>
+          <w:rFonts w:ascii="Arial" w:cs="Arial" w:eastAsia="Arial" w:hAnsi="Arial"/>
+          <w:i/>
+          <w:iCs/>
+          <w:color w:val="595959"/>
+          <w:sz w:val="18"/>
+          <w:szCs w:val="18"/>
+        </w:rPr>
+        <w:t xml:space="preserve">Figura 1: Captura Wireshark — Tráfico ICMP del comando tracert a www.poli.edu.co</w:t>
+      </w:r>
+    </w:p>
+    <w:p>
+      <w:pPr>
+        <w:spacing w:after="60" w:before="160"/>
+        <w:jc w:val="center"/>
+      </w:pPr>
+      <w:r>
+        <w:drawing>
+          <wp:inline distT="0" distB="0" distL="0" distR="0">
+            <wp:extent cx="5715000" cy="2409825"/>
+            <wp:effectExtent t="0" r="0" b="0" l="0"/>
+            <wp:docPr id="1" name="Figura 2: Captura Wireshark — Detalle de paquete ICMP (campos expandidos)" descr="Figura 2: Captura Wireshark — Detalle de paquete ICMP (campos expandidos)" title="Figura 2: Captura Wireshark — Detalle de paquete ICMP (campos expandidos)"/>
+            <wp:cNvGraphicFramePr>
+              <a:graphicFrameLocks xmlns:a="http://schemas.openxmlformats.org/drawingml/2006/main" noChangeAspect="1"/>
+            </wp:cNvGraphicFramePr>
+            <a:graphic xmlns:a="http://schemas.openxmlformats.org/drawingml/2006/main">
+              <a:graphicData uri="http://schemas.openxmlformats.org/drawingml/2006/picture">
+                <pic:pic xmlns:pic="http://schemas.openxmlformats.org/drawingml/2006/picture">
+                  <pic:nvPicPr>
+                    <pic:cNvPr id="0" name="" descr=""/>
+                    <pic:cNvPicPr>
+                      <a:picLocks noChangeAspect="1" noChangeArrowheads="1"/>
+                    </pic:cNvPicPr>
+                  </pic:nvPicPr>
+                  <pic:blipFill>
+                    <a:blip r:embed="rId10" cstate="none"/>
+                    <a:srcRect/>
+                    <a:stretch>
+                      <a:fillRect/>
+                    </a:stretch>
+                  </pic:blipFill>
+                  <pic:spPr bwMode="auto">
+                    <a:xfrm>
+                      <a:off x="0" y="0"/>
+                      <a:ext cx="5715000" cy="2409825"/>
+                    </a:xfrm>
+                    <a:prstGeom prst="rect">
+                      <a:avLst/>
+                    </a:prstGeom>
+                  </pic:spPr>
+                </pic:pic>
+              </a:graphicData>
+            </a:graphic>
+          </wp:inline>
+        </w:drawing>
+      </w:r>
+    </w:p>
+    <w:p>
+      <w:pPr>
+        <w:spacing w:after="160" w:before="0"/>
+        <w:jc w:val="center"/>
+      </w:pPr>
+      <w:r>
+        <w:rPr>
+          <w:rFonts w:ascii="Arial" w:cs="Arial" w:eastAsia="Arial" w:hAnsi="Arial"/>
+          <w:i/>
+          <w:iCs/>
+          <w:color w:val="595959"/>
+          <w:sz w:val="18"/>
+          <w:szCs w:val="18"/>
+        </w:rPr>
+        <w:t xml:space="preserve">Figura 2: Captura Wireshark — Detalle de paquete ICMP (campos expandidos)</w:t>
+      </w:r>
+    </w:p>
+    <w:p>
+      <w:pPr>
+        <w:spacing w:after="60" w:before="160"/>
+        <w:jc w:val="center"/>
+      </w:pPr>
+      <w:r>
+        <w:drawing>
+          <wp:inline distT="0" distB="0" distL="0" distR="0">
+            <wp:extent cx="5715000" cy="1924050"/>
+            <wp:effectExtent t="0" r="0" b="0" l="0"/>
+            <wp:docPr id="1" name="Figura 3: Captura Wireshark — Ping a www.poli.edu.co con tiempos RTT" descr="Figura 3: Captura Wireshark — Ping a www.poli.edu.co con tiempos RTT" title="Figura 3: Captura Wireshark — Ping a www.poli.edu.co con tiempos RTT"/>
+            <wp:cNvGraphicFramePr>
+              <a:graphicFrameLocks xmlns:a="http://schemas.openxmlformats.org/drawingml/2006/main" noChangeAspect="1"/>
+            </wp:cNvGraphicFramePr>
+            <a:graphic xmlns:a="http://schemas.openxmlformats.org/drawingml/2006/main">
+              <a:graphicData uri="http://schemas.openxmlformats.org/drawingml/2006/picture">
+                <pic:pic xmlns:pic="http://schemas.openxmlformats.org/drawingml/2006/picture">
+                  <pic:nvPicPr>
+                    <pic:cNvPr id="0" name="" descr=""/>
+                    <pic:cNvPicPr>
+                      <a:picLocks noChangeAspect="1" noChangeArrowheads="1"/>
+                    </pic:cNvPicPr>
+                  </pic:nvPicPr>
+                  <pic:blipFill>
+                    <a:blip r:embed="rId11" cstate="none"/>
+                    <a:srcRect/>
+                    <a:stretch>
+                      <a:fillRect/>
+                    </a:stretch>
+                  </pic:blipFill>
+                  <pic:spPr bwMode="auto">
+                    <a:xfrm>
+                      <a:off x="0" y="0"/>
+                      <a:ext cx="5715000" cy="1924050"/>
+                    </a:xfrm>
+                    <a:prstGeom prst="rect">
+                      <a:avLst/>
+                    </a:prstGeom>
+                  </pic:spPr>
+                </pic:pic>
+              </a:graphicData>
+            </a:graphic>
+          </wp:inline>
+        </w:drawing>
+      </w:r>
+    </w:p>
+    <w:p>
+      <w:pPr>
+        <w:spacing w:after="160" w:before="0"/>
+        <w:jc w:val="center"/>
+      </w:pPr>
+      <w:r>
+        <w:rPr>
+          <w:rFonts w:ascii="Arial" w:cs="Arial" w:eastAsia="Arial" w:hAnsi="Arial"/>
+          <w:i/>
+          <w:iCs/>
+          <w:color w:val="595959"/>
+          <w:sz w:val="18"/>
+          <w:szCs w:val="18"/>
+        </w:rPr>
+        <w:t xml:space="preserve">Figura 3: Captura Wireshark — Ping a www.poli.edu.co con tiempos RTT</w:t>
+      </w:r>
+    </w:p>
+    <w:p>
+      <w:r>
+        <w:t xml:space="preserve"/>
+      </w:r>
+    </w:p>
+    <w:p>
+      <w:pPr>
         <w:pStyle w:val="Heading1"/>
         <w:spacing w:after="120" w:before="300"/>
       </w:pPr>
@@ -6689,6 +6883,74 @@
           <w:szCs w:val="22"/>
         </w:rPr>
         <w:t xml:space="preserve">(3.163.115.117) — Fibra, ~10 km — East Point, GA, USA = www.poli.edu.co</w:t>
+      </w:r>
+    </w:p>
+    <w:p>
+      <w:r>
+        <w:t xml:space="preserve"/>
+      </w:r>
+    </w:p>
+    <w:p>
+      <w:pPr>
+        <w:spacing w:after="60" w:before="160"/>
+        <w:jc w:val="center"/>
+      </w:pPr>
+      <w:r>
+        <w:drawing>
+          <wp:inline distT="0" distB="0" distL="0" distR="0">
+            <wp:extent cx="5715000" cy="2590800"/>
+            <wp:effectExtent t="0" r="0" b="0" l="0"/>
+            <wp:docPr id="1" name="Figura 4: Diagrama de red — Topología completa desde el PC hasta www.poli.edu.co" descr="Figura 4: Diagrama de red — Topología completa desde el PC hasta www.poli.edu.co" title="Figura 4: Diagrama de red — Topología completa desde el PC hasta www.poli.edu.co"/>
+            <wp:cNvGraphicFramePr>
+              <a:graphicFrameLocks xmlns:a="http://schemas.openxmlformats.org/drawingml/2006/main" noChangeAspect="1"/>
+            </wp:cNvGraphicFramePr>
+            <a:graphic xmlns:a="http://schemas.openxmlformats.org/drawingml/2006/main">
+              <a:graphicData uri="http://schemas.openxmlformats.org/drawingml/2006/picture">
+                <pic:pic xmlns:pic="http://schemas.openxmlformats.org/drawingml/2006/picture">
+                  <pic:nvPicPr>
+                    <pic:cNvPr id="0" name="" descr=""/>
+                    <pic:cNvPicPr>
+                      <a:picLocks noChangeAspect="1" noChangeArrowheads="1"/>
+                    </pic:cNvPicPr>
+                  </pic:nvPicPr>
+                  <pic:blipFill>
+                    <a:blip r:embed="rId12" cstate="none"/>
+                    <a:srcRect/>
+                    <a:stretch>
+                      <a:fillRect/>
+                    </a:stretch>
+                  </pic:blipFill>
+                  <pic:spPr bwMode="auto">
+                    <a:xfrm>
+                      <a:off x="0" y="0"/>
+                      <a:ext cx="5715000" cy="2590800"/>
+                    </a:xfrm>
+                    <a:prstGeom prst="rect">
+                      <a:avLst/>
+                    </a:prstGeom>
+                  </pic:spPr>
+                </pic:pic>
+              </a:graphicData>
+            </a:graphic>
+          </wp:inline>
+        </w:drawing>
+      </w:r>
+    </w:p>
+    <w:p>
+      <w:pPr>
+        <w:spacing w:after="160" w:before="0"/>
+        <w:jc w:val="center"/>
+      </w:pPr>
+      <w:r>
+        <w:rPr>
+          <w:rFonts w:ascii="Arial" w:cs="Arial" w:eastAsia="Arial" w:hAnsi="Arial"/>
+          <w:i/>
+          <w:iCs/>
+          <w:color w:val="595959"/>
+          <w:sz w:val="18"/>
+          <w:szCs w:val="18"/>
+        </w:rPr>
+        <w:t xml:space="preserve">Figura 4: Diagrama de red — Topología completa desde el PC hasta www.poli.edu.co</w:t>
       </w:r>
     </w:p>
     <w:p>

</xml_diff>